<commit_message>
Company portal links and QR attendance
- Every company chooses its own address (remoteway.net/<link>) in Settings → Company; reserved and taken
  names are refused. The page shows the company's name and logo and asks who is signing in (employee,
  manager, HR, payroll, recruitment, admin — by plan); after sign-in that area opens when the role allows.
  Signing in from a company page requires membership; 2FA and SSO keep working
- QR attendance: office screens show a code that changes every minute (HMAC of the minute, current and
  previous minute accepted); employees scan with the phone, sign in if needed, and confirm clock-in/out.
  Optional same-network check, QR-required policy, screen link regeneration, QR tags in the attendance sheet
- Platform guide updated

Co-Authored-By: Claude Opus 5.5 <noreply@anthropic.com>
Claude-Session: https://claude.ai/code/session_01EifWFrePHzwjHxALoz86AL
</commit_message>
<xml_diff>
--- a/docs/RemoteWay-Platform-Guide.docx
+++ b/docs/RemoteWay-Platform-Guide.docx
@@ -98,7 +98,7 @@
           <w:szCs w:val="22"/>
           <w:rtl/>
         </w:rPr>
-        <w:t xml:space="preserve">الإصدار 1.0.0 (مرشّح الإطلاق rc.4)</w:t>
+        <w:t xml:space="preserve">الإصدار 1.0.0 (مرشّح الإطلاق rc.5)</w:t>
       </w:r>
     </w:p>
     <w:p>
@@ -2119,7 +2119,7 @@
           <w:szCs w:val="28"/>
           <w:rtl/>
         </w:rPr>
-        <w:t xml:space="preserve">إدارة الموظفين</w:t>
+        <w:t xml:space="preserve">رابط المنشأة</w:t>
       </w:r>
     </w:p>
     <w:p>
@@ -2140,7 +2140,7 @@
           <w:szCs w:val="22"/>
           <w:rtl/>
         </w:rPr>
-        <w:t xml:space="preserve">ملف كامل لكل موظف: البيانات الشخصية والوظيفية، والجنسية، والقسم، والمدير، والعقد، وفترة التجربة.</w:t>
+        <w:t xml:space="preserve">لكل منشأة رابط خاص تختاره، مثل remoteway.net/taawoni، يعرض اسمها وشعارها.</w:t>
       </w:r>
     </w:p>
     <w:p>
@@ -2161,7 +2161,7 @@
           <w:szCs w:val="22"/>
           <w:rtl/>
         </w:rPr>
-        <w:t xml:space="preserve">هيكل تنظيمي: أقسام ومواقع (منها المواقع عن بُعد) ومدير لكل قسم.</w:t>
+        <w:t xml:space="preserve">يختار الشخص طريقة دخوله: موظف، أو مدير، أو موارد بشرية، أو رواتب، أو توظيف، أو إدارة المنشأة، فيُفتح له القسم المناسب بعد الدخول إن كانت صلاحياته تسمح.</w:t>
       </w:r>
     </w:p>
     <w:p>
@@ -2182,7 +2182,7 @@
           <w:szCs w:val="22"/>
           <w:rtl/>
         </w:rPr>
-        <w:t xml:space="preserve">استيراد جماعي من CSV، وبحث وفلاتر وتصدير.</w:t>
+        <w:t xml:space="preserve">الدخول من رابط المنشأة يتحقق أن الحساب عضو فيها.</w:t>
       </w:r>
     </w:p>
     <w:p>
@@ -2201,7 +2201,7 @@
           <w:szCs w:val="28"/>
           <w:rtl/>
         </w:rPr>
-        <w:t xml:space="preserve">الحضور والانصراف</w:t>
+        <w:t xml:space="preserve">إدارة الموظفين</w:t>
       </w:r>
     </w:p>
     <w:p>
@@ -2222,7 +2222,131 @@
           <w:szCs w:val="22"/>
           <w:rtl/>
         </w:rPr>
+        <w:t xml:space="preserve">ملف كامل لكل موظف: البيانات الشخصية والوظيفية، والجنسية، والقسم، والمدير، والعقد، وفترة التجربة.</w:t>
+      </w:r>
+    </w:p>
+    <w:p>
+      <w:pPr>
+        <w:pStyle w:val="ListParagraph"/>
+        <w:numPr>
+          <w:ilvl w:val="0"/>
+          <w:numId w:val="2"/>
+        </w:numPr>
+        <w:bidi/>
+        <w:spacing w:after="60" w:line="300"/>
+      </w:pPr>
+      <w:r>
+        <w:rPr>
+          <w:rFonts w:ascii="Arial" w:cs="Arial" w:eastAsia="Arial" w:hAnsi="Arial"/>
+          <w:color w:val="0A0A0A"/>
+          <w:sz w:val="22"/>
+          <w:szCs w:val="22"/>
+          <w:rtl/>
+        </w:rPr>
+        <w:t xml:space="preserve">هيكل تنظيمي: أقسام ومواقع (منها المواقع عن بُعد) ومدير لكل قسم.</w:t>
+      </w:r>
+    </w:p>
+    <w:p>
+      <w:pPr>
+        <w:pStyle w:val="ListParagraph"/>
+        <w:numPr>
+          <w:ilvl w:val="0"/>
+          <w:numId w:val="2"/>
+        </w:numPr>
+        <w:bidi/>
+        <w:spacing w:after="60" w:line="300"/>
+      </w:pPr>
+      <w:r>
+        <w:rPr>
+          <w:rFonts w:ascii="Arial" w:cs="Arial" w:eastAsia="Arial" w:hAnsi="Arial"/>
+          <w:color w:val="0A0A0A"/>
+          <w:sz w:val="22"/>
+          <w:szCs w:val="22"/>
+          <w:rtl/>
+        </w:rPr>
+        <w:t xml:space="preserve">استيراد جماعي من CSV، وبحث وفلاتر وتصدير.</w:t>
+      </w:r>
+    </w:p>
+    <w:p>
+      <w:pPr>
+        <w:pStyle w:val="RWH2"/>
+        <w:bidi/>
+        <w:spacing w:after="120" w:before="240"/>
+      </w:pPr>
+      <w:r>
+        <w:rPr>
+          <w:rFonts w:ascii="Arial" w:cs="Arial" w:eastAsia="Arial" w:hAnsi="Arial"/>
+          <w:b/>
+          <w:bCs/>
+          <w:color w:val="0A0A0A"/>
+          <w:sz w:val="28"/>
+          <w:szCs w:val="28"/>
+          <w:rtl/>
+        </w:rPr>
+        <w:t xml:space="preserve">الحضور والانصراف</w:t>
+      </w:r>
+    </w:p>
+    <w:p>
+      <w:pPr>
+        <w:pStyle w:val="ListParagraph"/>
+        <w:numPr>
+          <w:ilvl w:val="0"/>
+          <w:numId w:val="2"/>
+        </w:numPr>
+        <w:bidi/>
+        <w:spacing w:after="60" w:line="300"/>
+      </w:pPr>
+      <w:r>
+        <w:rPr>
+          <w:rFonts w:ascii="Arial" w:cs="Arial" w:eastAsia="Arial" w:hAnsi="Arial"/>
+          <w:color w:val="0A0A0A"/>
+          <w:sz w:val="22"/>
+          <w:szCs w:val="22"/>
+          <w:rtl/>
+        </w:rPr>
         <w:t xml:space="preserve">تسجيل الحضور والانصراف من المتصفح، مع حفظ عنوان IP.</w:t>
+      </w:r>
+    </w:p>
+    <w:p>
+      <w:pPr>
+        <w:pStyle w:val="ListParagraph"/>
+        <w:numPr>
+          <w:ilvl w:val="0"/>
+          <w:numId w:val="2"/>
+        </w:numPr>
+        <w:bidi/>
+        <w:spacing w:after="60" w:line="300"/>
+      </w:pPr>
+      <w:r>
+        <w:rPr>
+          <w:rFonts w:ascii="Arial" w:cs="Arial" w:eastAsia="Arial" w:hAnsi="Arial"/>
+          <w:color w:val="0A0A0A"/>
+          <w:sz w:val="22"/>
+          <w:szCs w:val="22"/>
+          <w:rtl/>
+        </w:rPr>
+        <w:t xml:space="preserve">الحضور بمسح رمز QR: شاشة عند مدخل المكتب (جهاز لوحي أو تلفاز) تعرض رمزًا يتغير كل دقيقة، ويمسحه الموظف بكاميرا جواله ثم يؤكد الحضور أو الانصراف.</w:t>
+      </w:r>
+    </w:p>
+    <w:p>
+      <w:pPr>
+        <w:pStyle w:val="ListParagraph"/>
+        <w:numPr>
+          <w:ilvl w:val="0"/>
+          <w:numId w:val="2"/>
+        </w:numPr>
+        <w:bidi/>
+        <w:spacing w:after="60" w:line="300"/>
+      </w:pPr>
+      <w:r>
+        <w:rPr>
+          <w:rFonts w:ascii="Arial" w:cs="Arial" w:eastAsia="Arial" w:hAnsi="Arial"/>
+          <w:color w:val="0A0A0A"/>
+          <w:sz w:val="22"/>
+          <w:szCs w:val="22"/>
+          <w:rtl/>
+        </w:rPr>
+        <w:t xml:space="preserve">يمكن إلزام المنشأة بالتسجيل عبر QR فقط، وقبول المسح من شبكة المكتب فقط، حتى لا تنفع صورة الرمز المرسلة لشخص خارج المكتب.</w:t>
       </w:r>
     </w:p>
     <w:p>
@@ -11378,6 +11502,114 @@
                 <w:szCs w:val="19"/>
               </w:rPr>
               <w:t xml:space="preserve">/login  ·  /forgot</w:t>
+            </w:r>
+          </w:p>
+        </w:tc>
+      </w:tr>
+      <w:tr>
+        <w:tc>
+          <w:tcPr>
+            <w:tcW w:type="dxa" w:w="4000"/>
+            <w:tcMar>
+              <w:top w:type="dxa" w:w="60"/>
+              <w:left w:type="dxa" w:w="100"/>
+              <w:bottom w:type="dxa" w:w="60"/>
+              <w:right w:type="dxa" w:w="100"/>
+            </w:tcMar>
+          </w:tcPr>
+          <w:p>
+            <w:pPr>
+              <w:bidi/>
+            </w:pPr>
+            <w:r>
+              <w:rPr>
+                <w:rFonts w:ascii="Arial" w:cs="Arial" w:eastAsia="Arial" w:hAnsi="Arial"/>
+                <w:b w:val="false"/>
+                <w:color w:val="0A0A0A"/>
+                <w:sz w:val="19"/>
+                <w:szCs w:val="19"/>
+                <w:rtl/>
+              </w:rPr>
+              <w:t xml:space="preserve">رابط المنشأة (مثال)</w:t>
+            </w:r>
+          </w:p>
+        </w:tc>
+        <w:tc>
+          <w:tcPr>
+            <w:tcW w:type="dxa" w:w="5026"/>
+            <w:tcMar>
+              <w:top w:type="dxa" w:w="60"/>
+              <w:left w:type="dxa" w:w="100"/>
+              <w:bottom w:type="dxa" w:w="60"/>
+              <w:right w:type="dxa" w:w="100"/>
+            </w:tcMar>
+          </w:tcPr>
+          <w:p>
+            <w:pPr>
+              <w:jc w:val="right"/>
+            </w:pPr>
+            <w:r>
+              <w:rPr>
+                <w:rFonts w:ascii="Arial" w:cs="Arial" w:eastAsia="Arial" w:hAnsi="Arial"/>
+                <w:color w:val="0A0A0A"/>
+                <w:sz w:val="19"/>
+                <w:szCs w:val="19"/>
+              </w:rPr>
+              <w:t xml:space="preserve">/taawoni</w:t>
+            </w:r>
+          </w:p>
+        </w:tc>
+      </w:tr>
+      <w:tr>
+        <w:tc>
+          <w:tcPr>
+            <w:tcW w:type="dxa" w:w="4000"/>
+            <w:tcMar>
+              <w:top w:type="dxa" w:w="60"/>
+              <w:left w:type="dxa" w:w="100"/>
+              <w:bottom w:type="dxa" w:w="60"/>
+              <w:right w:type="dxa" w:w="100"/>
+            </w:tcMar>
+          </w:tcPr>
+          <w:p>
+            <w:pPr>
+              <w:bidi/>
+            </w:pPr>
+            <w:r>
+              <w:rPr>
+                <w:rFonts w:ascii="Arial" w:cs="Arial" w:eastAsia="Arial" w:hAnsi="Arial"/>
+                <w:b w:val="false"/>
+                <w:color w:val="0A0A0A"/>
+                <w:sz w:val="19"/>
+                <w:szCs w:val="19"/>
+                <w:rtl/>
+              </w:rPr>
+              <w:t xml:space="preserve">شاشة الحضور بـ QR</w:t>
+            </w:r>
+          </w:p>
+        </w:tc>
+        <w:tc>
+          <w:tcPr>
+            <w:tcW w:type="dxa" w:w="5026"/>
+            <w:tcMar>
+              <w:top w:type="dxa" w:w="60"/>
+              <w:left w:type="dxa" w:w="100"/>
+              <w:bottom w:type="dxa" w:w="60"/>
+              <w:right w:type="dxa" w:w="100"/>
+            </w:tcMar>
+          </w:tcPr>
+          <w:p>
+            <w:pPr>
+              <w:jc w:val="right"/>
+            </w:pPr>
+            <w:r>
+              <w:rPr>
+                <w:rFonts w:ascii="Arial" w:cs="Arial" w:eastAsia="Arial" w:hAnsi="Arial"/>
+                <w:color w:val="0A0A0A"/>
+                <w:sz w:val="19"/>
+                <w:szCs w:val="19"/>
+              </w:rPr>
+              <w:t xml:space="preserve">/app/attendance/qr</w:t>
             </w:r>
           </w:p>
         </w:tc>

</xml_diff>